<commit_message>
Fixed early tasks to use flow graphs
</commit_message>
<xml_diff>
--- a/Project_SomethingAwesome/Project/Project_Report_Tidied.docx
+++ b/Project_SomethingAwesome/Project/Project_Report_Tidied.docx
@@ -507,13 +507,16 @@
         <w:t xml:space="preserve">Order of the Old Crows resources and </w:t>
       </w:r>
       <w:r>
-        <w:t>related</w:t>
-      </w:r>
-      <w:r>
-        <w:t xml:space="preserve"> textbook </w:t>
-      </w:r>
-      <w:r>
-        <w:t>material helped identify recurring receiver-side concerns, including denial of service, spoofing, replay, localisation, traffic analysis, and weak trust boundaries between decoded signal fields and downstream software. These ideas were then adapted into civilian, synthetic scenarios so that Signal Forge can teach the security reasoning without reproducing real systems or encouraging live interference.</w:t>
+        <w:t>David L. Adamy’s EW 101, EW 102, and EW 103 textbooks</w:t>
+      </w:r>
+      <w:r>
+        <w:t xml:space="preserve"> helped identify recurring receiver-side concerns, including denial of service, spoofing, replay, localisation, traffic analysis, and weak trust boundaries between decoded signal fields and downstream software</w:t>
+      </w:r>
+      <w:r>
+        <w:t xml:space="preserve"> [6], [7], [8].</w:t>
+      </w:r>
+      <w:r>
+        <w:t xml:space="preserve"> These ideas were then adapted into civilian, synthetic scenarios so that Signal Forge can teach the security reasoning without reproducing real systems or encouraging live interference.</w:t>
       </w:r>
     </w:p>
     <w:p/>
@@ -2357,7 +2360,13 @@
         <w:pStyle w:val="Heading3"/>
       </w:pPr>
       <w:r>
-        <w:t>Task 1: Tunnel Context</w:t>
+        <w:t>Challenge</w:t>
+      </w:r>
+      <w:r>
+        <w:t xml:space="preserve"> 1: Tunnel Context</w:t>
+      </w:r>
+      <w:r>
+        <w:t xml:space="preserve"> (Beginner)</w:t>
       </w:r>
     </w:p>
     <w:p>
@@ -2383,7 +2392,19 @@
         <w:t xml:space="preserve">and then </w:t>
       </w:r>
       <w:r>
-        <w:t>go through a basic.</w:t>
+        <w:t>go through a basic</w:t>
+      </w:r>
+      <w:r>
+        <w:t xml:space="preserve"> jamming scenario for users to have a hands on experience of the threat model</w:t>
+      </w:r>
+      <w:r>
+        <w:t>.</w:t>
+      </w:r>
+      <w:r>
+        <w:t xml:space="preserve"> This allows users from various backgrounds to identify that more security enhancements are required on top off a </w:t>
+      </w:r>
+      <w:r>
+        <w:t xml:space="preserve">general signal. </w:t>
       </w:r>
     </w:p>
     <w:p>
@@ -2391,16 +2412,31 @@
         <w:pStyle w:val="Heading3"/>
       </w:pPr>
       <w:r>
-        <w:t xml:space="preserve">Task 2: </w:t>
+        <w:t xml:space="preserve">Challenge </w:t>
+      </w:r>
+      <w:r>
+        <w:t xml:space="preserve">2: </w:t>
       </w:r>
       <w:r>
         <w:t>Song Meta Data</w:t>
+      </w:r>
+      <w:r>
+        <w:t xml:space="preserve"> </w:t>
+      </w:r>
+      <w:r>
+        <w:t>(Beginner)</w:t>
       </w:r>
     </w:p>
     <w:p>
       <w:pPr>
         <w:spacing w:after="0"/>
       </w:pPr>
+      <w:r>
+        <w:t>This task is very sim</w:t>
+      </w:r>
+      <w:r>
+        <w:t xml:space="preserve">ilar to a </w:t>
+      </w:r>
     </w:p>
     <w:p>
       <w:pPr>
@@ -2680,6 +2716,7 @@
                 <w:b/>
                 <w:sz w:val="18"/>
               </w:rPr>
+              <w:lastRenderedPageBreak/>
               <w:t>Telemetry replay</w:t>
             </w:r>
           </w:p>
@@ -2760,7 +2797,6 @@
                 <w:b/>
                 <w:sz w:val="18"/>
               </w:rPr>
-              <w:lastRenderedPageBreak/>
               <w:t>Business-logic abuse</w:t>
             </w:r>
           </w:p>
@@ -3315,6 +3351,105 @@
           <w:t>GRCon 2025 CTF</w:t>
         </w:r>
       </w:hyperlink>
+    </w:p>
+    <w:p>
+      <w:pPr>
+        <w:ind w:left="360" w:hanging="360"/>
+        <w:rPr>
+          <w:kern w:val="2"/>
+          <w:lang w:eastAsia="en-AU"/>
+          <w14:ligatures w14:val="standardContextual"/>
+        </w:rPr>
+      </w:pPr>
+      <w:r>
+        <w:rPr>
+          <w:sz w:val="20"/>
+          <w:szCs w:val="20"/>
+        </w:rPr>
+        <w:t xml:space="preserve">[6] D. L. Adamy, </w:t>
+      </w:r>
+      <w:r>
+        <w:rPr>
+          <w:i/>
+          <w:iCs/>
+          <w:sz w:val="20"/>
+          <w:szCs w:val="20"/>
+        </w:rPr>
+        <w:t>EW 101: A First Course in Electronic Warfare</w:t>
+      </w:r>
+      <w:r>
+        <w:rPr>
+          <w:sz w:val="20"/>
+          <w:szCs w:val="20"/>
+        </w:rPr>
+        <w:t>. Norwood, MA: Artech House, 2001.</w:t>
+      </w:r>
+    </w:p>
+    <w:p>
+      <w:pPr>
+        <w:ind w:left="360" w:hanging="360"/>
+        <w:rPr>
+          <w:kern w:val="2"/>
+          <w:lang w:eastAsia="en-AU"/>
+          <w14:ligatures w14:val="standardContextual"/>
+        </w:rPr>
+      </w:pPr>
+      <w:r>
+        <w:rPr>
+          <w:sz w:val="20"/>
+          <w:szCs w:val="20"/>
+        </w:rPr>
+        <w:t xml:space="preserve">[7] D. L. Adamy, </w:t>
+      </w:r>
+      <w:r>
+        <w:rPr>
+          <w:i/>
+          <w:iCs/>
+          <w:sz w:val="20"/>
+          <w:szCs w:val="20"/>
+        </w:rPr>
+        <w:t>EW 102: A Second Course in Electronic Warfare</w:t>
+      </w:r>
+      <w:r>
+        <w:rPr>
+          <w:sz w:val="20"/>
+          <w:szCs w:val="20"/>
+        </w:rPr>
+        <w:t>. Norwood, MA: Artech House, 2004.</w:t>
+      </w:r>
+    </w:p>
+    <w:p>
+      <w:pPr>
+        <w:ind w:left="360" w:hanging="360"/>
+        <w:rPr>
+          <w:kern w:val="2"/>
+          <w:lang w:eastAsia="en-AU"/>
+          <w14:ligatures w14:val="standardContextual"/>
+        </w:rPr>
+      </w:pPr>
+      <w:r>
+        <w:rPr>
+          <w:sz w:val="20"/>
+          <w:szCs w:val="20"/>
+        </w:rPr>
+        <w:t xml:space="preserve">[8] D. L. Adamy, </w:t>
+      </w:r>
+      <w:r>
+        <w:rPr>
+          <w:i/>
+          <w:iCs/>
+          <w:sz w:val="20"/>
+          <w:szCs w:val="20"/>
+        </w:rPr>
+        <w:t>EW 103: Tactical Battlefield Communications Electronic Warfare</w:t>
+      </w:r>
+      <w:r>
+        <w:rPr>
+          <w:sz w:val="20"/>
+          <w:szCs w:val="20"/>
+        </w:rPr>
+        <w:t>. Norwood, MA: Artech House, 2008.</w:t>
+      </w:r>
     </w:p>
     <w:p>
       <w:pPr>

</xml_diff>